<commit_message>
docs(business): 18-slide leadership deck built locally with python-pptx, and the docx footer/heading fix (SCORM/LXP study)
Deck: title, why now, what we did, report claim check (native chart), matrix
comparison (native chart, targets labelled as targets), open lanes, where
Sentientia stands, architecture, localisation, speech gate, compliance,
prototype screenshots, pilot evidence, staged plan, cost tiers, risks, asks and
roadmap; speaker notes cite the study sections. Text is measured with Arial
before it is written and every slide was exported through PowerPoint and
inspected. No Gamma, no network. The docx is regenerated with Arial headings
and a single-line footer with page numbers.

Co-Authored-By: Claude Sonnet 5.5 <noreply@anthropic.com>
</commit_message>
<xml_diff>
--- a/moodle-enhancement/docs/business/SENTIENTIA-CONTENT-ENGINE-CSUITE-BRIEF-2026-10-15.docx
+++ b/moodle-enhancement/docs/business/SENTIENTIA-CONTENT-ENGINE-CSUITE-BRIEF-2026-10-15.docx
@@ -3673,9 +3673,6 @@
   <w:p>
     <w:pPr>
       <w:pStyle w:val="Footer"/>
-      <w:tabs>
-        <w:tab w:pos="9026" w:val="right"/>
-      </w:tabs>
     </w:pPr>
     <w:r>
       <w:rPr>
@@ -3684,10 +3681,7 @@
         <w:color w:val="5A6070"/>
         <w:sz w:val="16"/>
       </w:rPr>
-      <w:t>Sentientia Content Engine — C-suite brief · Confidential</w:t>
-    </w:r>
-    <w:r>
-      <w:tab/>
+      <w:t xml:space="preserve">Sentientia Content Engine — C-suite brief · Confidential · </w:t>
     </w:r>
     <w:r>
       <w:rPr>
@@ -4157,7 +4151,7 @@
       <w:outlineLvl w:val="0"/>
     </w:pPr>
     <w:rPr>
-      <w:rFonts w:asciiTheme="majorHAnsi" w:eastAsiaTheme="majorEastAsia" w:hAnsiTheme="majorHAnsi" w:cstheme="majorBidi" w:ascii="Arial" w:hAnsi="Arial" w:eastAsia="Arial"/>
+      <w:rFonts w:ascii="Arial" w:hAnsi="Arial" w:eastAsia="Arial"/>
       <w:b/>
       <w:bCs/>
       <w:color w:val="1A1A2E"/>
@@ -4181,7 +4175,7 @@
       <w:outlineLvl w:val="1"/>
     </w:pPr>
     <w:rPr>
-      <w:rFonts w:asciiTheme="majorHAnsi" w:eastAsiaTheme="majorEastAsia" w:hAnsiTheme="majorHAnsi" w:cstheme="majorBidi" w:ascii="Arial" w:hAnsi="Arial" w:eastAsia="Arial"/>
+      <w:rFonts w:ascii="Arial" w:hAnsi="Arial" w:eastAsia="Arial"/>
       <w:b/>
       <w:bCs/>
       <w:color w:val="0066A7"/>

</xml_diff>